<commit_message>
Update rename instruction: 9 steps, AI matching, verification, xlsx
- Maket_CP_Инструкция_переименование.docx
- Step 3: updated to mention xlsx with images, removed "ref-photos may
  not load" note — they now load automatically from PDF and Excel
- Step 6: AI auto-matching ("Расставить (AI)") as primary path,
  manual matching as fallback for corrections
- Step 7 (NEW): verification step — "Подтвердить все" before export
- Step 8: fixed button name to "Скачать список (CSV)"
- Step 9: renumbered (was 8)
- Summary table updated to 9 rows with correct button labels

Co-Authored-By: Claude Opus 4.6 <noreply@anthropic.com>
</commit_message>
<xml_diff>
--- a/Maket_CP_Инструкция_переименование.docx
+++ b/Maket_CP_Инструкция_переименование.docx
@@ -765,7 +765,7 @@
           <w:sz w:val="22"/>
           <w:szCs w:val="22"/>
         </w:rPr>
-        <w:t xml:space="preserve"> с артикулами (от клиента/бренда) — или </w:t>
+        <w:t xml:space="preserve"> или </w:t>
       </w:r>
       <w:r>
         <w:rPr>
@@ -778,20 +778,20 @@
           <w:sz w:val="22"/>
           <w:szCs w:val="22"/>
         </w:rPr>
-        <w:t xml:space="preserve">Excel/CSV</w:t>
-      </w:r>
-      <w:r>
-        <w:rPr>
-          <w:rFonts w:ascii="Arial" w:cs="Arial" w:eastAsia="Arial" w:hAnsi="Arial"/>
-          <w:b w:val="false"/>
-          <w:bCs w:val="false"/>
-          <w:i w:val="false"/>
-          <w:iCs w:val="false"/>
-          <w:color w:val="444444"/>
-          <w:sz w:val="22"/>
-          <w:szCs w:val="22"/>
-        </w:rPr>
-        <w:t xml:space="preserve">, если PDF нет.</w:t>
+        <w:t xml:space="preserve">Excel</w:t>
+      </w:r>
+      <w:r>
+        <w:rPr>
+          <w:rFonts w:ascii="Arial" w:cs="Arial" w:eastAsia="Arial" w:hAnsi="Arial"/>
+          <w:b w:val="false"/>
+          <w:bCs w:val="false"/>
+          <w:i w:val="false"/>
+          <w:iCs w:val="false"/>
+          <w:color w:val="444444"/>
+          <w:sz w:val="22"/>
+          <w:szCs w:val="22"/>
+        </w:rPr>
+        <w:t xml:space="preserve"> с артикулами (от клиента/бренда). Картинки из PDF и Excel извлекутся автоматически.</w:t>
       </w:r>
     </w:p>
     <w:p>
@@ -872,7 +872,7 @@
                 <w:sz w:val="22"/>
                 <w:szCs w:val="22"/>
               </w:rPr>
-              <w:t xml:space="preserve">Если референс-фото не загрузились автоматически — это нормально. Они нужны только как визуальная подсказка. Переименование работает и без них.</w:t>
+              <w:t xml:space="preserve">Референс-фото из файла загрузятся автоматически. Они используются для AI-расстановки артикулов по карточкам (шаг 6). Если какие-то фото не распознались — не страшно, их можно сопоставить вручную.</w:t>
             </w:r>
           </w:p>
         </w:tc>
@@ -1211,7 +1211,7 @@
           <w:sz w:val="22"/>
           <w:szCs w:val="22"/>
         </w:rPr>
-        <w:t xml:space="preserve">Вернитесь на вкладку «Артикулы».</w:t>
+        <w:t xml:space="preserve">Вернитесь на вкладку «Артикулы». В блоке «Сопоставление» вы увидите карточки слева и артикулы справа.</w:t>
       </w:r>
     </w:p>
     <w:p>
@@ -1234,7 +1234,7 @@
           <w:sz w:val="22"/>
           <w:szCs w:val="22"/>
         </w:rPr>
-        <w:t xml:space="preserve">Найдите нужный артикул в списке. В столбце «Карточка» нажмите </w:t>
+        <w:t xml:space="preserve">Нажмите кнопку </w:t>
       </w:r>
       <w:r>
         <w:rPr>
@@ -1247,20 +1247,20 @@
           <w:sz w:val="22"/>
           <w:szCs w:val="22"/>
         </w:rPr>
-        <w:t xml:space="preserve">«--»</w:t>
-      </w:r>
-      <w:r>
-        <w:rPr>
-          <w:rFonts w:ascii="Arial" w:cs="Arial" w:eastAsia="Arial" w:hAnsi="Arial"/>
-          <w:b w:val="false"/>
-          <w:bCs w:val="false"/>
-          <w:i w:val="false"/>
-          <w:iCs w:val="false"/>
-          <w:color w:val="444444"/>
-          <w:sz w:val="22"/>
-          <w:szCs w:val="22"/>
-        </w:rPr>
-        <w:t xml:space="preserve">.</w:t>
+        <w:t xml:space="preserve">«Расставить (AI)»</w:t>
+      </w:r>
+      <w:r>
+        <w:rPr>
+          <w:rFonts w:ascii="Arial" w:cs="Arial" w:eastAsia="Arial" w:hAnsi="Arial"/>
+          <w:b w:val="false"/>
+          <w:bCs w:val="false"/>
+          <w:i w:val="false"/>
+          <w:iCs w:val="false"/>
+          <w:color w:val="444444"/>
+          <w:sz w:val="22"/>
+          <w:szCs w:val="22"/>
+        </w:rPr>
+        <w:t xml:space="preserve"> — приложение автоматически сопоставит артикулы с карточками по фотографиям. Это занимает 30–60 секунд.</w:t>
       </w:r>
     </w:p>
     <w:p>
@@ -1283,7 +1283,7 @@
           <w:sz w:val="22"/>
           <w:szCs w:val="22"/>
         </w:rPr>
-        <w:t xml:space="preserve">Кликните на карточку с фото этого товара — связь установится.</w:t>
+        <w:t xml:space="preserve">Проверьте результат. Если AI ошибся в каких-то парах — кликните на карточку, затем на правильный артикул, чтобы исправить связь вручную.</w:t>
       </w:r>
     </w:p>
     <w:p>
@@ -1332,7 +1332,7 @@
           <w:sz w:val="22"/>
           <w:szCs w:val="22"/>
         </w:rPr>
-        <w:t xml:space="preserve">. Повторите для всех артикулов.</w:t>
+        <w:t xml:space="preserve">.</w:t>
       </w:r>
     </w:p>
     <w:p>
@@ -1365,7 +1365,26 @@
           <w:sz w:val="26"/>
           <w:szCs w:val="26"/>
         </w:rPr>
-        <w:t xml:space="preserve">Экспортируйте список переименования</w:t>
+        <w:t xml:space="preserve">Подтвердите сопоставления</w:t>
+      </w:r>
+    </w:p>
+    <w:p>
+      <w:pPr>
+        <w:spacing w:after="80" w:before="0"/>
+        <w:jc w:val="left"/>
+      </w:pPr>
+      <w:r>
+        <w:rPr>
+          <w:rFonts w:ascii="Arial" w:cs="Arial" w:eastAsia="Arial" w:hAnsi="Arial"/>
+          <w:b w:val="false"/>
+          <w:bCs w:val="false"/>
+          <w:i w:val="false"/>
+          <w:iCs w:val="false"/>
+          <w:color w:val="444444"/>
+          <w:sz w:val="22"/>
+          <w:szCs w:val="22"/>
+        </w:rPr>
+        <w:t xml:space="preserve">После сопоставления откроется блок «Верификация».</w:t>
       </w:r>
     </w:p>
     <w:p>
@@ -1388,7 +1407,7 @@
           <w:sz w:val="22"/>
           <w:szCs w:val="22"/>
         </w:rPr>
-        <w:t xml:space="preserve">На вкладке «Артикулы» нажмите </w:t>
+        <w:t xml:space="preserve">Просмотрите каждую пару «артикул – карточка». Если всё верно, нажмите </w:t>
       </w:r>
       <w:r>
         <w:rPr>
@@ -1401,20 +1420,151 @@
           <w:sz w:val="22"/>
           <w:szCs w:val="22"/>
         </w:rPr>
-        <w:t xml:space="preserve">«Список на переименование»</w:t>
-      </w:r>
-      <w:r>
-        <w:rPr>
-          <w:rFonts w:ascii="Arial" w:cs="Arial" w:eastAsia="Arial" w:hAnsi="Arial"/>
-          <w:b w:val="false"/>
-          <w:bCs w:val="false"/>
-          <w:i w:val="false"/>
-          <w:iCs w:val="false"/>
-          <w:color w:val="444444"/>
-          <w:sz w:val="22"/>
-          <w:szCs w:val="22"/>
-        </w:rPr>
-        <w:t xml:space="preserve"> (или «Экспорт CSV»).</w:t>
+        <w:t xml:space="preserve">«Подтвердить все»</w:t>
+      </w:r>
+      <w:r>
+        <w:rPr>
+          <w:rFonts w:ascii="Arial" w:cs="Arial" w:eastAsia="Arial" w:hAnsi="Arial"/>
+          <w:b w:val="false"/>
+          <w:bCs w:val="false"/>
+          <w:i w:val="false"/>
+          <w:iCs w:val="false"/>
+          <w:color w:val="444444"/>
+          <w:sz w:val="22"/>
+          <w:szCs w:val="22"/>
+        </w:rPr>
+        <w:t xml:space="preserve"> — или подтверждайте по одному кнопкой «Подтвердить».</w:t>
+      </w:r>
+    </w:p>
+    <w:p>
+      <w:pPr>
+        <w:pStyle w:val="ListParagraph"/>
+        <w:numPr>
+          <w:ilvl w:val="0"/>
+          <w:numId w:val="2"/>
+        </w:numPr>
+        <w:spacing w:after="60" w:before="60"/>
+      </w:pPr>
+      <w:r>
+        <w:rPr>
+          <w:rFonts w:ascii="Arial" w:cs="Arial" w:eastAsia="Arial" w:hAnsi="Arial"/>
+          <w:b w:val="false"/>
+          <w:bCs w:val="false"/>
+          <w:i w:val="false"/>
+          <w:iCs w:val="false"/>
+          <w:color w:val="444444"/>
+          <w:sz w:val="22"/>
+          <w:szCs w:val="22"/>
+        </w:rPr>
+        <w:t xml:space="preserve">Статус изменится на </w:t>
+      </w:r>
+      <w:r>
+        <w:rPr>
+          <w:rFonts w:ascii="Arial" w:cs="Arial" w:eastAsia="Arial" w:hAnsi="Arial"/>
+          <w:b/>
+          <w:bCs/>
+          <w:i w:val="false"/>
+          <w:iCs w:val="false"/>
+          <w:color w:val="2563EB"/>
+          <w:sz w:val="22"/>
+          <w:szCs w:val="22"/>
+        </w:rPr>
+        <w:t xml:space="preserve">verified</w:t>
+      </w:r>
+      <w:r>
+        <w:rPr>
+          <w:rFonts w:ascii="Arial" w:cs="Arial" w:eastAsia="Arial" w:hAnsi="Arial"/>
+          <w:b w:val="false"/>
+          <w:bCs w:val="false"/>
+          <w:i w:val="false"/>
+          <w:iCs w:val="false"/>
+          <w:color w:val="444444"/>
+          <w:sz w:val="22"/>
+          <w:szCs w:val="22"/>
+        </w:rPr>
+        <w:t xml:space="preserve">. После этого появится блок «Переименование файлов».</w:t>
+      </w:r>
+    </w:p>
+    <w:p>
+      <w:pPr>
+        <w:spacing w:after="100" w:before="80"/>
+        <w:jc w:val="left"/>
+      </w:pPr>
+    </w:p>
+    <w:p>
+      <w:pPr>
+        <w:spacing w:after="80" w:before="240"/>
+      </w:pPr>
+      <w:r>
+        <w:rPr>
+          <w:rFonts w:ascii="Arial" w:cs="Arial" w:eastAsia="Arial" w:hAnsi="Arial"/>
+          <w:b/>
+          <w:bCs/>
+          <w:color w:val="2563EB"/>
+          <w:sz w:val="26"/>
+          <w:szCs w:val="26"/>
+        </w:rPr>
+        <w:t xml:space="preserve">Шаг 8  </w:t>
+      </w:r>
+      <w:r>
+        <w:rPr>
+          <w:rFonts w:ascii="Arial" w:cs="Arial" w:eastAsia="Arial" w:hAnsi="Arial"/>
+          <w:b/>
+          <w:bCs/>
+          <w:color w:val="444444"/>
+          <w:sz w:val="26"/>
+          <w:szCs w:val="26"/>
+        </w:rPr>
+        <w:t xml:space="preserve">Экспортируйте список переименования</w:t>
+      </w:r>
+    </w:p>
+    <w:p>
+      <w:pPr>
+        <w:pStyle w:val="ListParagraph"/>
+        <w:numPr>
+          <w:ilvl w:val="0"/>
+          <w:numId w:val="2"/>
+        </w:numPr>
+        <w:spacing w:after="60" w:before="60"/>
+      </w:pPr>
+      <w:r>
+        <w:rPr>
+          <w:rFonts w:ascii="Arial" w:cs="Arial" w:eastAsia="Arial" w:hAnsi="Arial"/>
+          <w:b w:val="false"/>
+          <w:bCs w:val="false"/>
+          <w:i w:val="false"/>
+          <w:iCs w:val="false"/>
+          <w:color w:val="444444"/>
+          <w:sz w:val="22"/>
+          <w:szCs w:val="22"/>
+        </w:rPr>
+        <w:t xml:space="preserve">На вкладке «Артикулы» нажмите </w:t>
+      </w:r>
+      <w:r>
+        <w:rPr>
+          <w:rFonts w:ascii="Arial" w:cs="Arial" w:eastAsia="Arial" w:hAnsi="Arial"/>
+          <w:b/>
+          <w:bCs/>
+          <w:i w:val="false"/>
+          <w:iCs w:val="false"/>
+          <w:color w:val="444444"/>
+          <w:sz w:val="22"/>
+          <w:szCs w:val="22"/>
+        </w:rPr>
+        <w:t xml:space="preserve">«Скачать список (CSV)»</w:t>
+      </w:r>
+      <w:r>
+        <w:rPr>
+          <w:rFonts w:ascii="Arial" w:cs="Arial" w:eastAsia="Arial" w:hAnsi="Arial"/>
+          <w:b w:val="false"/>
+          <w:bCs w:val="false"/>
+          <w:i w:val="false"/>
+          <w:iCs w:val="false"/>
+          <w:color w:val="444444"/>
+          <w:sz w:val="22"/>
+          <w:szCs w:val="22"/>
+        </w:rPr>
+        <w:t xml:space="preserve">.</w:t>
       </w:r>
     </w:p>
     <w:p>
@@ -1599,7 +1749,7 @@
           <w:sz w:val="26"/>
           <w:szCs w:val="26"/>
         </w:rPr>
-        <w:t xml:space="preserve">Шаг 8  </w:t>
+        <w:t xml:space="preserve">Шаг 9  </w:t>
       </w:r>
       <w:r>
         <w:rPr>
@@ -2200,7 +2350,7 @@
           <w:sz w:val="28"/>
           <w:szCs w:val="28"/>
         </w:rPr>
-        <w:t xml:space="preserve">Итого — 8 шагов</w:t>
+        <w:t xml:space="preserve">Итого — 9 шагов</w:t>
       </w:r>
     </w:p>
     <w:tbl>
@@ -2969,7 +3119,7 @@
                 <w:sz w:val="20"/>
                 <w:szCs w:val="20"/>
               </w:rPr>
-              <w:t xml:space="preserve">Привязать артикулы к карточкам</w:t>
+              <w:t xml:space="preserve">Расставить артикулы (AI или вручную)</w:t>
             </w:r>
           </w:p>
         </w:tc>
@@ -3006,7 +3156,7 @@
                 <w:sz w:val="20"/>
                 <w:szCs w:val="20"/>
               </w:rPr>
-              <w:t xml:space="preserve">Артикулы → столбец Карточка</w:t>
+              <w:t xml:space="preserve">Артикулы → Расставить (AI)</w:t>
             </w:r>
           </w:p>
         </w:tc>
@@ -3082,7 +3232,7 @@
                 <w:sz w:val="20"/>
                 <w:szCs w:val="20"/>
               </w:rPr>
-              <w:t xml:space="preserve">Экспортировать CSV</w:t>
+              <w:t xml:space="preserve">Подтвердить сопоставления</w:t>
             </w:r>
           </w:p>
         </w:tc>
@@ -3119,7 +3269,7 @@
                 <w:sz w:val="20"/>
                 <w:szCs w:val="20"/>
               </w:rPr>
-              <w:t xml:space="preserve">Артикулы → Список на переименование</w:t>
+              <w:t xml:space="preserve">Артикулы → Подтвердить все</w:t>
             </w:r>
           </w:p>
         </w:tc>
@@ -3195,7 +3345,7 @@
                 <w:sz w:val="20"/>
                 <w:szCs w:val="20"/>
               </w:rPr>
-              <w:t xml:space="preserve">Запустить rename.exe</w:t>
+              <w:t xml:space="preserve">Скачать CSV</w:t>
             </w:r>
           </w:p>
         </w:tc>
@@ -3209,6 +3359,119 @@
               <w:right w:val="none"/>
             </w:tcBorders>
             <w:shd w:fill="F8FAFC" w:val="clear"/>
+            <w:tcMar>
+              <w:top w:type="dxa" w:w="100"/>
+              <w:left w:type="dxa" w:w="140"/>
+              <w:bottom w:type="dxa" w:w="100"/>
+              <w:right w:type="dxa" w:w="140"/>
+            </w:tcMar>
+          </w:tcPr>
+          <w:p>
+            <w:pPr>
+              <w:spacing w:after="100" w:before="0"/>
+              <w:jc w:val="left"/>
+            </w:pPr>
+            <w:r>
+              <w:rPr>
+                <w:rFonts w:ascii="Arial" w:cs="Arial" w:eastAsia="Arial" w:hAnsi="Arial"/>
+                <w:b w:val="false"/>
+                <w:bCs w:val="false"/>
+                <w:i w:val="false"/>
+                <w:iCs w:val="false"/>
+                <w:color w:val="444444"/>
+                <w:sz w:val="20"/>
+                <w:szCs w:val="20"/>
+              </w:rPr>
+              <w:t xml:space="preserve">Артикулы → Скачать список (CSV)</w:t>
+            </w:r>
+          </w:p>
+        </w:tc>
+      </w:tr>
+      <w:tr>
+        <w:tc>
+          <w:tcPr>
+            <w:tcW w:type="dxa" w:w="900"/>
+            <w:tcBorders>
+              <w:top w:val="single" w:color="E2E8F0" w:sz="1"/>
+              <w:left w:val="none"/>
+              <w:bottom w:val="single" w:color="E2E8F0" w:sz="1"/>
+              <w:right w:val="none"/>
+            </w:tcBorders>
+            <w:shd w:fill="FFFFFF" w:val="clear"/>
+            <w:tcMar>
+              <w:top w:type="dxa" w:w="100"/>
+              <w:left w:type="dxa" w:w="140"/>
+              <w:bottom w:type="dxa" w:w="100"/>
+              <w:right w:type="dxa" w:w="140"/>
+            </w:tcMar>
+          </w:tcPr>
+          <w:p>
+            <w:pPr>
+              <w:spacing w:after="100" w:before="0"/>
+              <w:jc w:val="left"/>
+            </w:pPr>
+            <w:r>
+              <w:rPr>
+                <w:rFonts w:ascii="Arial" w:cs="Arial" w:eastAsia="Arial" w:hAnsi="Arial"/>
+                <w:b/>
+                <w:bCs/>
+                <w:i w:val="false"/>
+                <w:iCs w:val="false"/>
+                <w:color w:val="2563EB"/>
+                <w:sz w:val="20"/>
+                <w:szCs w:val="20"/>
+              </w:rPr>
+              <w:t xml:space="preserve">9</w:t>
+            </w:r>
+          </w:p>
+        </w:tc>
+        <w:tc>
+          <w:tcPr>
+            <w:tcW w:type="dxa" w:w="5000"/>
+            <w:tcBorders>
+              <w:top w:val="single" w:color="E2E8F0" w:sz="1"/>
+              <w:left w:val="none"/>
+              <w:bottom w:val="single" w:color="E2E8F0" w:sz="1"/>
+              <w:right w:val="none"/>
+            </w:tcBorders>
+            <w:shd w:fill="FFFFFF" w:val="clear"/>
+            <w:tcMar>
+              <w:top w:type="dxa" w:w="100"/>
+              <w:left w:type="dxa" w:w="140"/>
+              <w:bottom w:type="dxa" w:w="100"/>
+              <w:right w:type="dxa" w:w="140"/>
+            </w:tcMar>
+          </w:tcPr>
+          <w:p>
+            <w:pPr>
+              <w:spacing w:after="100" w:before="0"/>
+              <w:jc w:val="left"/>
+            </w:pPr>
+            <w:r>
+              <w:rPr>
+                <w:rFonts w:ascii="Arial" w:cs="Arial" w:eastAsia="Arial" w:hAnsi="Arial"/>
+                <w:b w:val="false"/>
+                <w:bCs w:val="false"/>
+                <w:i w:val="false"/>
+                <w:iCs w:val="false"/>
+                <w:color w:val="444444"/>
+                <w:sz w:val="20"/>
+                <w:szCs w:val="20"/>
+              </w:rPr>
+              <w:t xml:space="preserve">Запустить rename.exe</w:t>
+            </w:r>
+          </w:p>
+        </w:tc>
+        <w:tc>
+          <w:tcPr>
+            <w:tcW w:type="dxa" w:w="3460"/>
+            <w:tcBorders>
+              <w:top w:val="single" w:color="E2E8F0" w:sz="1"/>
+              <w:left w:val="none"/>
+              <w:bottom w:val="single" w:color="E2E8F0" w:sz="1"/>
+              <w:right w:val="none"/>
+            </w:tcBorders>
+            <w:shd w:fill="FFFFFF" w:val="clear"/>
             <w:tcMar>
               <w:top w:type="dxa" w:w="100"/>
               <w:left w:type="dxa" w:w="140"/>

</xml_diff>